<commit_message>
Language rule: always mirror the advert, fall back to the user's language
- section 2.2 Language and dialect: advert language and dialect decide the
  output, section names included; user's language when the advert is unclear
- printed in the /cv report so it can be overridden, one line
- ATS checklist row changed from spelling to language and dialect
- cover letter follows the same rule
- both HTML templates carry the instruction in the file header
- compact version (Appendix C) updated and still under 1500 characters
</commit_message>
<xml_diff>
--- a/PROJECT-INSTRUCTIONS.docx
+++ b/PROJECT-INSTRUCTIONS.docx
@@ -1148,7 +1148,117 @@
           <w:sz w:val="21"/>
           <w:color w:val="1F3864"/>
         </w:rPr>
-        <w:t xml:space="preserve">2.2 Never do these</w:t>
+        <w:t xml:space="preserve">2.2 Language and dialect</w:t>
+      </w:r>
+    </w:p>
+    <w:p>
+      <w:pPr>
+        <w:spacing w:before="0" w:after="100"/>
+      </w:pPr>
+      <w:r>
+        <w:rPr>
+          <w:rFonts w:ascii="Calibri" w:hAnsi="Calibri"/>
+          <w:sz w:val="21"/>
+        </w:rPr>
+        <w:t xml:space="preserve">Match the language of the advert. An advert in Portuguese gets a Portuguese CV, with Portuguese date formats and section names. A UK advert gets UK spelling (</w:t>
+      </w:r>
+      <w:r>
+        <w:rPr>
+          <w:rFonts w:ascii="Consolas" w:hAnsi="Consolas"/>
+          <w:sz w:val="19"/>
+          <w:color w:val="1F2328"/>
+        </w:rPr>
+        <w:t xml:space="preserve">organisation</w:t>
+      </w:r>
+      <w:r>
+        <w:rPr>
+          <w:rFonts w:ascii="Calibri" w:hAnsi="Calibri"/>
+          <w:sz w:val="21"/>
+        </w:rPr>
+        <w:t xml:space="preserve">, </w:t>
+      </w:r>
+      <w:r>
+        <w:rPr>
+          <w:rFonts w:ascii="Consolas" w:hAnsi="Consolas"/>
+          <w:sz w:val="19"/>
+          <w:color w:val="1F2328"/>
+        </w:rPr>
+        <w:t xml:space="preserve">programme</w:t>
+      </w:r>
+      <w:r>
+        <w:rPr>
+          <w:rFonts w:ascii="Calibri" w:hAnsi="Calibri"/>
+          <w:sz w:val="21"/>
+        </w:rPr>
+        <w:t xml:space="preserve">), a US advert gets US spelling (</w:t>
+      </w:r>
+      <w:r>
+        <w:rPr>
+          <w:rFonts w:ascii="Consolas" w:hAnsi="Consolas"/>
+          <w:sz w:val="19"/>
+          <w:color w:val="1F2328"/>
+        </w:rPr>
+        <w:t xml:space="preserve">organization</w:t>
+      </w:r>
+      <w:r>
+        <w:rPr>
+          <w:rFonts w:ascii="Calibri" w:hAnsi="Calibri"/>
+          <w:sz w:val="21"/>
+        </w:rPr>
+        <w:t xml:space="preserve">, </w:t>
+      </w:r>
+      <w:r>
+        <w:rPr>
+          <w:rFonts w:ascii="Consolas" w:hAnsi="Consolas"/>
+          <w:sz w:val="19"/>
+          <w:color w:val="1F2328"/>
+        </w:rPr>
+        <w:t xml:space="preserve">program</w:t>
+      </w:r>
+      <w:r>
+        <w:rPr>
+          <w:rFonts w:ascii="Calibri" w:hAnsi="Calibri"/>
+          <w:sz w:val="21"/>
+        </w:rPr>
+        <w:t xml:space="preserve">), and neither gets a mix. Dialect, date format, phone format and CV conventions all follow the target market.</w:t>
+      </w:r>
+    </w:p>
+    <w:p>
+      <w:pPr>
+        <w:spacing w:before="0" w:after="100"/>
+      </w:pPr>
+      <w:r>
+        <w:rPr>
+          <w:rFonts w:ascii="Calibri" w:hAnsi="Calibri"/>
+          <w:sz w:val="21"/>
+        </w:rPr>
+        <w:t xml:space="preserve">When the advert is in two languages, or the advert is silent and the person writes to you in a different language, use the person's language. Say which one you picked in the report, in one line, so it can be overridden.</w:t>
+      </w:r>
+    </w:p>
+    <w:p>
+      <w:pPr>
+        <w:spacing w:before="0" w:after="100"/>
+      </w:pPr>
+      <w:r>
+        <w:rPr>
+          <w:rFonts w:ascii="Calibri" w:hAnsi="Calibri"/>
+          <w:sz w:val="21"/>
+        </w:rPr>
+        <w:t xml:space="preserve">Section names translate with the document: Experience becomes Experiência profissional, Education becomes Formação académica, Skills becomes Competências. A mixed-language CV reads as machine output to a recruiter, so keep one language through the whole document, cover letter included.</w:t>
+      </w:r>
+    </w:p>
+    <w:p>
+      <w:pPr>
+        <w:spacing w:before="120" w:after="20"/>
+      </w:pPr>
+      <w:r>
+        <w:rPr>
+          <w:rFonts w:ascii="Calibri" w:hAnsi="Calibri"/>
+          <w:b/>
+          <w:sz w:val="21"/>
+          <w:color w:val="1F3864"/>
+        </w:rPr>
+        <w:t xml:space="preserve">2.3 Never do these</w:t>
       </w:r>
     </w:p>
     <w:p>
@@ -1659,7 +1769,7 @@
           <w:rFonts w:ascii="Calibri" w:hAnsi="Calibri"/>
           <w:sz w:val="21"/>
         </w:rPr>
-        <w:t xml:space="preserve"> Extract into a table: the exact job title as written, the location and work pattern, seniority signals (years, "senior", "lead", "hands-on"), the must-have requirements, the nice-to-haves, the named tools and systems, the qualifications, and the soft requirements. Then add a short list of inferences: what the advert implies but does not say. A long list of duties usually means no process exists yet. "Wear many hats" means a small team. A named methodology means they will ask about it. Labour-market context matters too: the same advert words mean different things in different countries, so read the requirements in the market the job sits in.</w:t>
+        <w:t xml:space="preserve"> Extract into a table: the exact job title as written, the location and work pattern, seniority signals (years, "senior", "lead", "hands-on"), the must-have requirements, the nice-to-haves, the named tools and systems, the qualifications, and the soft requirements. Then add a short list of inferences: what the advert implies but does not say. A long list of duties usually means no process exists yet. "Wear many hats" means a small team. A named methodology means they will ask about it. Labour-market context matters too: the same advert words mean different things in different countries, so read the requirements in the market the job sits in. Note the language and dialect of the advert at the same time, because that decides the language of everything you produce.</w:t>
       </w:r>
     </w:p>
     <w:p>
@@ -2303,24 +2413,24 @@
                 <w:rFonts w:ascii="Calibri" w:hAnsi="Calibri"/>
                 <w:sz w:val="21"/>
               </w:rPr>
-              <w:t xml:space="preserve">Spelling</w:t>
-            </w:r>
-          </w:p>
-        </w:tc>
-        <w:tc>
-          <w:tcPr>
-            <w:tcW w:w="4933" w:type="dxa"/>
-          </w:tcPr>
-          <w:p>
-            <w:pPr>
-              <w:spacing w:before="0" w:after="20"/>
-            </w:pPr>
-            <w:r>
-              <w:rPr>
-                <w:rFonts w:ascii="Calibri" w:hAnsi="Calibri"/>
-                <w:sz w:val="21"/>
-              </w:rPr>
-              <w:t xml:space="preserve">One dialect throughout, matching the advert</w:t>
+              <w:t xml:space="preserve">Language</w:t>
+            </w:r>
+          </w:p>
+        </w:tc>
+        <w:tc>
+          <w:tcPr>
+            <w:tcW w:w="4933" w:type="dxa"/>
+          </w:tcPr>
+          <w:p>
+            <w:pPr>
+              <w:spacing w:before="0" w:after="20"/>
+            </w:pPr>
+            <w:r>
+              <w:rPr>
+                <w:rFonts w:ascii="Calibri" w:hAnsi="Calibri"/>
+                <w:sz w:val="21"/>
+              </w:rPr>
+              <w:t xml:space="preserve">The advert's language and dialect throughout, section names included: EN-UK, EN-US, PT-PT, DE</w:t>
             </w:r>
           </w:p>
         </w:tc>
@@ -4035,7 +4145,7 @@
           <w:sz w:val="21"/>
           <w:color w:val="1F2328"/>
         </w:rPr>
-        <w:t xml:space="preserve">Commands: /setup (read the uploaded CV, output a Career Inventory: roles with dates, scope, results, tools, education, languages, plus the issues in the current CV and up to eight questions). /cv plus a pasted advert (extract requirements, map evidence to each as matched, partial or gap, then write a two-page single-column ATS-safe CV: name, target title, contact line, three-line profile, experience newest first with numbers in the bullets, skills grouped, education. Report keyword coverage and gaps, then export). /cover plus an advert (three-paragraph letter, same rules). /check (anti-slop and ATS pass on a pasted draft).</w:t>
+        <w:t xml:space="preserve">/setup: read the uploaded CV, output a Career Inventory (roles with dates, scope, results, tools, education, languages), what is weak in the CV, and up to eight questions.</w:t>
       </w:r>
     </w:p>
     <w:p>
@@ -4050,7 +4160,7 @@
           <w:sz w:val="21"/>
           <w:color w:val="1F2328"/>
         </w:rPr>
-        <w:t xml:space="preserve"> </w:t>
+        <w:t xml:space="preserve">/cv with an advert: extract requirements, map evidence as matched, partial or gap, then write a two-page single-column ATS-safe CV (name, target title, contact line, three-line profile, experience newest first with numbers, grouped skills, education). Report coverage and gaps, then export.</w:t>
       </w:r>
     </w:p>
     <w:p>
@@ -4065,7 +4175,7 @@
           <w:sz w:val="21"/>
           <w:color w:val="1F2328"/>
         </w:rPr>
-        <w:t xml:space="preserve">Format: one column, no tables, text boxes, graphics or photo, standard headings, dates as Mon YYYY, font 10.5-12pt, filename Firstname-Lastname-Role-Company.</w:t>
+        <w:t xml:space="preserve">/cover: three-paragraph letter, same rules. /check: anti-slop and ATS pass on a pasted draft.</w:t>
       </w:r>
     </w:p>
     <w:p>
@@ -4095,7 +4205,67 @@
           <w:sz w:val="21"/>
           <w:color w:val="1F2328"/>
         </w:rPr>
-        <w:t xml:space="preserve">Writing: apply anti-slop-rules.md and banned-words.md. No em dashes beyond one per 500 words, no rule of three, no passive voice, no cliches (results-driven, team player, passionate about, responsible for), no "With over N years of experience". Name numbers, tools and outcomes. Never claim a file exists unless you produced it. Export .docx with md2docx.py, and PDF with weasyprint or headless Chrome.</w:t>
+        <w:t xml:space="preserve">Language: mirror the advert's language and dialect (EN-UK, EN-US, PT-PT, DE), spelling, dates and section names included; if unclear, use the user's language. Same for the cover letter.</w:t>
+      </w:r>
+    </w:p>
+    <w:p>
+      <w:pPr>
+        <w:shd w:val="clear" w:color="auto" w:fill="F5F6F8"/>
+        <w:ind w:left="170"/>
+        <w:spacing w:before="0" w:after="0"/>
+      </w:pPr>
+      <w:r>
+        <w:rPr>
+          <w:rFonts w:ascii="Consolas" w:hAnsi="Consolas"/>
+          <w:sz w:val="21"/>
+          <w:color w:val="1F2328"/>
+        </w:rPr>
+        <w:t xml:space="preserve"> </w:t>
+      </w:r>
+    </w:p>
+    <w:p>
+      <w:pPr>
+        <w:shd w:val="clear" w:color="auto" w:fill="F5F6F8"/>
+        <w:ind w:left="170"/>
+        <w:spacing w:before="0" w:after="0"/>
+      </w:pPr>
+      <w:r>
+        <w:rPr>
+          <w:rFonts w:ascii="Consolas" w:hAnsi="Consolas"/>
+          <w:sz w:val="21"/>
+          <w:color w:val="1F2328"/>
+        </w:rPr>
+        <w:t xml:space="preserve">Format: one column, no tables, graphics or photo, standard headings, dates Mon YYYY, font 10.5-12pt, filename Firstname-Lastname-Role-Company.</w:t>
+      </w:r>
+    </w:p>
+    <w:p>
+      <w:pPr>
+        <w:shd w:val="clear" w:color="auto" w:fill="F5F6F8"/>
+        <w:ind w:left="170"/>
+        <w:spacing w:before="0" w:after="0"/>
+      </w:pPr>
+      <w:r>
+        <w:rPr>
+          <w:rFonts w:ascii="Consolas" w:hAnsi="Consolas"/>
+          <w:sz w:val="21"/>
+          <w:color w:val="1F2328"/>
+        </w:rPr>
+        <w:t xml:space="preserve"> </w:t>
+      </w:r>
+    </w:p>
+    <w:p>
+      <w:pPr>
+        <w:shd w:val="clear" w:color="auto" w:fill="F5F6F8"/>
+        <w:ind w:left="170"/>
+        <w:spacing w:before="0" w:after="0"/>
+      </w:pPr>
+      <w:r>
+        <w:rPr>
+          <w:rFonts w:ascii="Consolas" w:hAnsi="Consolas"/>
+          <w:sz w:val="21"/>
+          <w:color w:val="1F2328"/>
+        </w:rPr>
+        <w:t xml:space="preserve">Writing: apply anti-slop-rules.md and banned-words.md. No em dashes beyond one per 500 words, no rule of three, no passive voice, no cliches (results-driven, team player, passionate about, responsible for), no "With over N years of experience". Name numbers, tools and outcomes. Never claim a file exists unless you produced it. Export .docx with md2docx.py, PDF with weasyprint or headless Chrome.</w:t>
       </w:r>
     </w:p>
     <w:p>

</xml_diff>

<commit_message>
Bilingual: add European Portuguese (pt-PT) branch
- pt-PT/ carries a full duplicate, not a summary: PROJECT-INSTRUCTIONS.pt-PT.md,
  README.pt-PT.md, anti-slop-rules.pt-PT.md, both HTML templates, and generated
  .docx + PDF
- no_slop_check.py gains --lang {en,pt,all}: Portuguese banned vocabulary,
  phrases, openers and CV cliches, case-insensitive; punctuation counters stay
  language-neutral
- English docs point at the pt-PT/ branch and teach the --lang pt checker flag
- READMEs carry a language switcher; EN stays first at the root
</commit_message>
<xml_diff>
--- a/PROJECT-INSTRUCTIONS.docx
+++ b/PROJECT-INSTRUCTIONS.docx
@@ -847,6 +847,33 @@
     </w:p>
     <w:p>
       <w:pPr>
+        <w:spacing w:before="0" w:after="100"/>
+      </w:pPr>
+      <w:r>
+        <w:rPr>
+          <w:rFonts w:ascii="Calibri" w:hAnsi="Calibri"/>
+          <w:sz w:val="21"/>
+        </w:rPr>
+        <w:t xml:space="preserve">A Portuguese branch of this whole project lives in </w:t>
+      </w:r>
+      <w:r>
+        <w:rPr>
+          <w:rFonts w:ascii="Consolas" w:hAnsi="Consolas"/>
+          <w:sz w:val="19"/>
+          <w:color w:val="1F2328"/>
+        </w:rPr>
+        <w:t xml:space="preserve">pt-PT/</w:t>
+      </w:r>
+      <w:r>
+        <w:rPr>
+          <w:rFonts w:ascii="Calibri" w:hAnsi="Calibri"/>
+          <w:sz w:val="21"/>
+        </w:rPr>
+        <w:t xml:space="preserve">, written in European Portuguese: instructions, rule set, templates and generated documents. Point Portuguese-speaking people there instead of translating on the fly.</w:t>
+      </w:r>
+    </w:p>
+    <w:p>
+      <w:pPr>
         <w:spacing w:before="0" w:after="60"/>
       </w:pPr>
     </w:p>
@@ -2473,7 +2500,22 @@
           <w:sz w:val="21"/>
           <w:color w:val="1F2328"/>
         </w:rPr>
-        <w:t xml:space="preserve">python3 no_slop_check.py cv-draft.md</w:t>
+        <w:t xml:space="preserve">python3 no_slop_check.py cv-draft.md          # English</w:t>
+      </w:r>
+    </w:p>
+    <w:p>
+      <w:pPr>
+        <w:shd w:val="clear" w:color="auto" w:fill="F5F6F8"/>
+        <w:ind w:left="170"/>
+        <w:spacing w:before="0" w:after="0"/>
+      </w:pPr>
+      <w:r>
+        <w:rPr>
+          <w:rFonts w:ascii="Consolas" w:hAnsi="Consolas"/>
+          <w:sz w:val="21"/>
+          <w:color w:val="1F2328"/>
+        </w:rPr>
+        <w:t xml:space="preserve">python3 no_slop_check.py --lang pt cv-draft.md   # European Portuguese</w:t>
       </w:r>
     </w:p>
     <w:p>

</xml_diff>

<commit_message>
Add LinkedIn branch: export, audit, rewrite
Bolt a LinkedIn section onto the CV project, in both languages.

- LINKEDIN.md and pt-PT/LINKEDIN.pt-PT.md: the three export routes with their
  real limits (Save to PDF is desktop-only, English-only, drops Projects and
  Featured, and went missing for some accounts in 2026; the data archive gives
  plain-text CSVs in any language in about ten minutes), field limits, the audit
  contract, and the rewrite order
- field-by-field rules for headline, About, experience, skills, Featured and
  recommendations, with weak-versus-better examples
- new /linkedin command in both instruction sets and a 5.1 section pointing at
  the procedure
- Prompt 9 (profile audit) and Prompt 10 (headline only) in both prompt packs,
  plus the five-minute commenting habit
- compact versions updated and still under 1,500 characters in both languages
- built to .docx and PDF in both languages
</commit_message>
<xml_diff>
--- a/PROJECT-INSTRUCTIONS.docx
+++ b/PROJECT-INSTRUCTIONS.docx
@@ -398,6 +398,50 @@
                 <w:sz w:val="19"/>
                 <w:color w:val="1F2328"/>
               </w:rPr>
+              <w:t xml:space="preserve">/linkedin</w:t>
+            </w:r>
+            <w:r>
+              <w:rPr>
+                <w:rFonts w:ascii="Calibri" w:hAnsi="Calibri"/>
+                <w:sz w:val="21"/>
+              </w:rPr>
+              <w:t xml:space="preserve"> + exported profile, optionally an advert</w:t>
+            </w:r>
+          </w:p>
+        </w:tc>
+        <w:tc>
+          <w:tcPr>
+            <w:tcW w:w="4933" w:type="dxa"/>
+          </w:tcPr>
+          <w:p>
+            <w:pPr>
+              <w:spacing w:before="0" w:after="20"/>
+            </w:pPr>
+            <w:r>
+              <w:rPr>
+                <w:rFonts w:ascii="Calibri" w:hAnsi="Calibri"/>
+                <w:sz w:val="21"/>
+              </w:rPr>
+              <w:t xml:space="preserve">Audits the profile and rewrites headline, About, experience and skills</w:t>
+            </w:r>
+          </w:p>
+        </w:tc>
+      </w:tr>
+      <w:tr>
+        <w:tc>
+          <w:tcPr>
+            <w:tcW w:w="4933" w:type="dxa"/>
+          </w:tcPr>
+          <w:p>
+            <w:pPr>
+              <w:spacing w:before="0" w:after="20"/>
+            </w:pPr>
+            <w:r>
+              <w:rPr>
+                <w:rFonts w:ascii="Consolas" w:hAnsi="Consolas"/>
+                <w:sz w:val="19"/>
+                <w:color w:val="1F2328"/>
+              </w:rPr>
               <w:t xml:space="preserve">/check</w:t>
             </w:r>
           </w:p>
@@ -570,6 +614,23 @@
           <w:color w:val="1F2328"/>
         </w:rPr>
         <w:t xml:space="preserve">cover-letter-print-template.html</w:t>
+      </w:r>
+    </w:p>
+    <w:p>
+      <w:pPr>
+        <w:numPr>
+          <w:ilvl w:val="0"/>
+          <w:numId w:val="1"/>
+        </w:numPr>
+        <w:spacing w:before="0" w:after="40"/>
+      </w:pPr>
+      <w:r>
+        <w:rPr>
+          <w:rFonts w:ascii="Consolas" w:hAnsi="Consolas"/>
+          <w:sz w:val="19"/>
+          <w:color w:val="1F2328"/>
+        </w:rPr>
+        <w:t xml:space="preserve">LINKEDIN.md</w:t>
       </w:r>
     </w:p>
     <w:p>
@@ -2964,6 +3025,274 @@
     </w:p>
     <w:p>
       <w:pPr>
+        <w:spacing w:before="120" w:after="20"/>
+      </w:pPr>
+      <w:r>
+        <w:rPr>
+          <w:rFonts w:ascii="Calibri" w:hAnsi="Calibri"/>
+          <w:b/>
+          <w:sz w:val="21"/>
+          <w:color w:val="1F3864"/>
+        </w:rPr>
+        <w:t xml:space="preserve">5.1 The LinkedIn profile</w:t>
+      </w:r>
+    </w:p>
+    <w:p>
+      <w:pPr>
+        <w:spacing w:before="0" w:after="100"/>
+      </w:pPr>
+      <w:r>
+        <w:rPr>
+          <w:rFonts w:ascii="Consolas" w:hAnsi="Consolas"/>
+          <w:sz w:val="19"/>
+          <w:color w:val="1F2328"/>
+        </w:rPr>
+        <w:t xml:space="preserve">/linkedin</w:t>
+      </w:r>
+      <w:r>
+        <w:rPr>
+          <w:rFonts w:ascii="Calibri" w:hAnsi="Calibri"/>
+          <w:sz w:val="21"/>
+        </w:rPr>
+        <w:t xml:space="preserve"> covers the other half of a job search, and </w:t>
+      </w:r>
+      <w:r>
+        <w:rPr>
+          <w:rFonts w:ascii="Consolas" w:hAnsi="Consolas"/>
+          <w:sz w:val="19"/>
+          <w:color w:val="1F2328"/>
+        </w:rPr>
+        <w:t xml:space="preserve">LINKEDIN.md</w:t>
+      </w:r>
+      <w:r>
+        <w:rPr>
+          <w:rFonts w:ascii="Calibri" w:hAnsi="Calibri"/>
+          <w:sz w:val="21"/>
+        </w:rPr>
+        <w:t xml:space="preserve"> holds the full procedure. The short version, for when the person asks:</w:t>
+      </w:r>
+    </w:p>
+    <w:p>
+      <w:pPr>
+        <w:numPr>
+          <w:ilvl w:val="0"/>
+          <w:numId w:val="1"/>
+        </w:numPr>
+        <w:spacing w:before="0" w:after="40"/>
+      </w:pPr>
+      <w:r>
+        <w:rPr>
+          <w:rFonts w:ascii="Calibri" w:hAnsi="Calibri"/>
+          <w:b/>
+          <w:sz w:val="21"/>
+        </w:rPr>
+        <w:t xml:space="preserve">Get the profile out first.</w:t>
+      </w:r>
+      <w:r>
+        <w:rPr>
+          <w:rFonts w:ascii="Calibri" w:hAnsi="Calibri"/>
+          <w:sz w:val="21"/>
+        </w:rPr>
+        <w:t xml:space="preserve"> Save to PDF works only on English profiles with the account language set to English, and in 2026 it went missing for some accounts, so treat it as the quick look. The data archive (Settings and Privacy, Data privacy, Get a copy of your data) returns </w:t>
+      </w:r>
+      <w:r>
+        <w:rPr>
+          <w:rFonts w:ascii="Consolas" w:hAnsi="Consolas"/>
+          <w:sz w:val="19"/>
+          <w:color w:val="1F2328"/>
+        </w:rPr>
+        <w:t xml:space="preserve">Profile.csv</w:t>
+      </w:r>
+      <w:r>
+        <w:rPr>
+          <w:rFonts w:ascii="Calibri" w:hAnsi="Calibri"/>
+          <w:sz w:val="21"/>
+        </w:rPr>
+        <w:t xml:space="preserve">, </w:t>
+      </w:r>
+      <w:r>
+        <w:rPr>
+          <w:rFonts w:ascii="Consolas" w:hAnsi="Consolas"/>
+          <w:sz w:val="19"/>
+          <w:color w:val="1F2328"/>
+        </w:rPr>
+        <w:t xml:space="preserve">Positions.csv</w:t>
+      </w:r>
+      <w:r>
+        <w:rPr>
+          <w:rFonts w:ascii="Calibri" w:hAnsi="Calibri"/>
+          <w:sz w:val="21"/>
+        </w:rPr>
+        <w:t xml:space="preserve">, </w:t>
+      </w:r>
+      <w:r>
+        <w:rPr>
+          <w:rFonts w:ascii="Consolas" w:hAnsi="Consolas"/>
+          <w:sz w:val="19"/>
+          <w:color w:val="1F2328"/>
+        </w:rPr>
+        <w:t xml:space="preserve">Education.csv</w:t>
+      </w:r>
+      <w:r>
+        <w:rPr>
+          <w:rFonts w:ascii="Calibri" w:hAnsi="Calibri"/>
+          <w:sz w:val="21"/>
+        </w:rPr>
+        <w:t xml:space="preserve">, </w:t>
+      </w:r>
+      <w:r>
+        <w:rPr>
+          <w:rFonts w:ascii="Consolas" w:hAnsi="Consolas"/>
+          <w:sz w:val="19"/>
+          <w:color w:val="1F2328"/>
+        </w:rPr>
+        <w:t xml:space="preserve">Skills.csv</w:t>
+      </w:r>
+      <w:r>
+        <w:rPr>
+          <w:rFonts w:ascii="Calibri" w:hAnsi="Calibri"/>
+          <w:sz w:val="21"/>
+        </w:rPr>
+        <w:t xml:space="preserve"> and </w:t>
+      </w:r>
+      <w:r>
+        <w:rPr>
+          <w:rFonts w:ascii="Consolas" w:hAnsi="Consolas"/>
+          <w:sz w:val="19"/>
+          <w:color w:val="1F2328"/>
+        </w:rPr>
+        <w:t xml:space="preserve">Certifications.csv</w:t>
+      </w:r>
+      <w:r>
+        <w:rPr>
+          <w:rFonts w:ascii="Calibri" w:hAnsi="Calibri"/>
+          <w:sz w:val="21"/>
+        </w:rPr>
+        <w:t xml:space="preserve"> in about ten minutes, in any language, with no truncation. That is the text to audit. Ask the person to type in what no export reaches: Featured items, projects, the text of recommendations, and the order of their skills.</w:t>
+      </w:r>
+    </w:p>
+    <w:p>
+      <w:pPr>
+        <w:numPr>
+          <w:ilvl w:val="0"/>
+          <w:numId w:val="1"/>
+        </w:numPr>
+        <w:spacing w:before="0" w:after="40"/>
+      </w:pPr>
+      <w:r>
+        <w:rPr>
+          <w:rFonts w:ascii="Calibri" w:hAnsi="Calibri"/>
+          <w:b/>
+          <w:sz w:val="21"/>
+        </w:rPr>
+        <w:t xml:space="preserve">Field limits that bite.</w:t>
+      </w:r>
+      <w:r>
+        <w:rPr>
+          <w:rFonts w:ascii="Calibri" w:hAnsi="Calibri"/>
+          <w:sz w:val="21"/>
+        </w:rPr>
+        <w:t xml:space="preserve"> Headline 220 characters, About 2,600, experience description 2,000 per role, 50 skills with three pinned, recommendation 3,000.</w:t>
+      </w:r>
+    </w:p>
+    <w:p>
+      <w:pPr>
+        <w:numPr>
+          <w:ilvl w:val="0"/>
+          <w:numId w:val="1"/>
+        </w:numPr>
+        <w:spacing w:before="0" w:after="40"/>
+      </w:pPr>
+      <w:r>
+        <w:rPr>
+          <w:rFonts w:ascii="Calibri" w:hAnsi="Calibri"/>
+          <w:b/>
+          <w:sz w:val="21"/>
+        </w:rPr>
+        <w:t xml:space="preserve">Order of work.</w:t>
+      </w:r>
+      <w:r>
+        <w:rPr>
+          <w:rFonts w:ascii="Calibri" w:hAnsi="Calibri"/>
+          <w:sz w:val="21"/>
+        </w:rPr>
+        <w:t xml:space="preserve"> Headline first, because it carries the most search weight and gets wasted most often. Then About, then the experience entries, then skills, then Featured and recommendations.</w:t>
+      </w:r>
+    </w:p>
+    <w:p>
+      <w:pPr>
+        <w:numPr>
+          <w:ilvl w:val="0"/>
+          <w:numId w:val="1"/>
+        </w:numPr>
+        <w:spacing w:before="0" w:after="40"/>
+      </w:pPr>
+      <w:r>
+        <w:rPr>
+          <w:rFonts w:ascii="Calibri" w:hAnsi="Calibri"/>
+          <w:b/>
+          <w:sz w:val="21"/>
+        </w:rPr>
+        <w:t xml:space="preserve">Output contract.</w:t>
+      </w:r>
+      <w:r>
+        <w:rPr>
+          <w:rFonts w:ascii="Calibri" w:hAnsi="Calibri"/>
+          <w:sz w:val="21"/>
+        </w:rPr>
+        <w:t xml:space="preserve"> A diff table (field, current text, the problem, the rewrite), then the rewrites each with a character count, then keyword coverage against the target advert, then gaps. Never let a rewrite run past a field limit: truncation is silent and cannot be fixed after publishing.</w:t>
+      </w:r>
+    </w:p>
+    <w:p>
+      <w:pPr>
+        <w:numPr>
+          <w:ilvl w:val="0"/>
+          <w:numId w:val="1"/>
+        </w:numPr>
+        <w:spacing w:before="0" w:after="40"/>
+      </w:pPr>
+      <w:r>
+        <w:rPr>
+          <w:rFonts w:ascii="Calibri" w:hAnsi="Calibri"/>
+          <w:b/>
+          <w:sz w:val="21"/>
+        </w:rPr>
+        <w:t xml:space="preserve">Consistency.</w:t>
+      </w:r>
+      <w:r>
+        <w:rPr>
+          <w:rFonts w:ascii="Calibri" w:hAnsi="Calibri"/>
+          <w:sz w:val="21"/>
+        </w:rPr>
+        <w:t xml:space="preserve"> Dates, titles and numbers must match the CV exactly. Recruiters cross-check the two documents.</w:t>
+      </w:r>
+    </w:p>
+    <w:p>
+      <w:pPr>
+        <w:numPr>
+          <w:ilvl w:val="0"/>
+          <w:numId w:val="1"/>
+        </w:numPr>
+        <w:spacing w:before="0" w:after="40"/>
+      </w:pPr>
+      <w:r>
+        <w:rPr>
+          <w:rFonts w:ascii="Calibri" w:hAnsi="Calibri"/>
+          <w:b/>
+          <w:sz w:val="21"/>
+        </w:rPr>
+        <w:t xml:space="preserve">Activity stays minimal.</w:t>
+      </w:r>
+      <w:r>
+        <w:rPr>
+          <w:rFonts w:ascii="Calibri" w:hAnsi="Calibri"/>
+          <w:sz w:val="21"/>
+        </w:rPr>
+        <w:t xml:space="preserve"> Comment substantively on three to five posts a week. No posting plan, and never raw model output: LinkedIn shipped a "seems like AI slop" report option in 2026, and its own definition of slop is polished text with no point of view.</w:t>
+      </w:r>
+    </w:p>
+    <w:p>
+      <w:pPr>
         <w:spacing w:before="0" w:after="60"/>
       </w:pPr>
     </w:p>
@@ -4157,7 +4486,7 @@
           <w:sz w:val="21"/>
           <w:color w:val="1F2328"/>
         </w:rPr>
-        <w:t xml:space="preserve">You are a senior recruiter and CV writer. Work only from facts the user gives you; never invent employers, dates, titles, metrics, tools or qualifications. If evidence is missing, list it as a gap and ask.</w:t>
+        <w:t xml:space="preserve">You are a senior recruiter and CV writer. Work only from facts given; never invent employers, dates, titles, metrics, tools or qualifications. If evidence is missing, list it as a gap and ask.</w:t>
       </w:r>
     </w:p>
     <w:p>
@@ -4187,7 +4516,7 @@
           <w:sz w:val="21"/>
           <w:color w:val="1F2328"/>
         </w:rPr>
-        <w:t xml:space="preserve">/setup: read the uploaded CV, output a Career Inventory (roles with dates, scope, results, tools, education, languages), what is weak in the CV, and up to eight questions.</w:t>
+        <w:t xml:space="preserve">/setup: read the uploaded CV, output a Career Inventory (roles with dates, scope, results, tools, education, languages), what is weak, and up to eight questions.</w:t>
       </w:r>
     </w:p>
     <w:p>
@@ -4202,7 +4531,7 @@
           <w:sz w:val="21"/>
           <w:color w:val="1F2328"/>
         </w:rPr>
-        <w:t xml:space="preserve">/cv with an advert: extract requirements, map evidence as matched, partial or gap, then write a two-page single-column ATS-safe CV (name, target title, contact line, three-line profile, experience newest first with numbers, grouped skills, education). Report coverage and gaps, then export.</w:t>
+        <w:t xml:space="preserve">/cv with an advert: extract requirements, map evidence as matched, partial or gap, then write a two-page single-column ATS-safe CV (name, target title, contact line, three-line profile, experience newest first, grouped skills, education). Report coverage and gaps, then export.</w:t>
       </w:r>
     </w:p>
     <w:p>
@@ -4232,7 +4561,7 @@
           <w:sz w:val="21"/>
           <w:color w:val="1F2328"/>
         </w:rPr>
-        <w:t xml:space="preserve"> </w:t>
+        <w:t xml:space="preserve">/linkedin: audit the exported profile, rewrite headline, About, experience, skills.</w:t>
       </w:r>
     </w:p>
     <w:p>
@@ -4247,7 +4576,7 @@
           <w:sz w:val="21"/>
           <w:color w:val="1F2328"/>
         </w:rPr>
-        <w:t xml:space="preserve">Language: mirror the advert's language and dialect (EN-UK, EN-US, PT-PT, DE), spelling, dates and section names included; if unclear, use the user's language. Same for the cover letter.</w:t>
+        <w:t xml:space="preserve"> </w:t>
       </w:r>
     </w:p>
     <w:p>
@@ -4262,7 +4591,7 @@
           <w:sz w:val="21"/>
           <w:color w:val="1F2328"/>
         </w:rPr>
-        <w:t xml:space="preserve"> </w:t>
+        <w:t xml:space="preserve">Language: mirror the advert's language and dialect (EN-UK, PT-PT, DE), spelling and dates included; if unclear, use the user's language. Same for the cover letter.</w:t>
       </w:r>
     </w:p>
     <w:p>
@@ -4277,7 +4606,7 @@
           <w:sz w:val="21"/>
           <w:color w:val="1F2328"/>
         </w:rPr>
-        <w:t xml:space="preserve">Format: one column, no tables, graphics or photo, standard headings, dates Mon YYYY, font 10.5-12pt, filename Firstname-Lastname-Role-Company.</w:t>
+        <w:t xml:space="preserve"> </w:t>
       </w:r>
     </w:p>
     <w:p>
@@ -4292,7 +4621,7 @@
           <w:sz w:val="21"/>
           <w:color w:val="1F2328"/>
         </w:rPr>
-        <w:t xml:space="preserve"> </w:t>
+        <w:t xml:space="preserve">Format: one column, no tables, graphics or photo, standard headings, dates Mon YYYY, font 10.5-12pt, filename Firstname-Lastname-Role-Company.</w:t>
       </w:r>
     </w:p>
     <w:p>
@@ -4307,7 +4636,22 @@
           <w:sz w:val="21"/>
           <w:color w:val="1F2328"/>
         </w:rPr>
-        <w:t xml:space="preserve">Writing: apply anti-slop-rules.md and banned-words.md. No em dashes beyond one per 500 words, no rule of three, no passive voice, no cliches (results-driven, team player, passionate about, responsible for), no "With over N years of experience". Name numbers, tools and outcomes. Never claim a file exists unless you produced it. Export .docx with md2docx.py, PDF with weasyprint or headless Chrome.</w:t>
+        <w:t xml:space="preserve"> </w:t>
+      </w:r>
+    </w:p>
+    <w:p>
+      <w:pPr>
+        <w:shd w:val="clear" w:color="auto" w:fill="F5F6F8"/>
+        <w:ind w:left="170"/>
+        <w:spacing w:before="0" w:after="0"/>
+      </w:pPr>
+      <w:r>
+        <w:rPr>
+          <w:rFonts w:ascii="Consolas" w:hAnsi="Consolas"/>
+          <w:sz w:val="21"/>
+          <w:color w:val="1F2328"/>
+        </w:rPr>
+        <w:t xml:space="preserve">Writing: apply anti-slop-rules.md and banned-words.md. No em dashes beyond one per 500 words, no rule of three, no passive voice, no cliches (results-driven, team player), no "With over N years of experience". Name numbers, tools and outcomes. Never claim a file you did not produce. Export .docx with md2docx.py, PDF with weasyprint or headless Chrome.</w:t>
       </w:r>
     </w:p>
     <w:p>

</xml_diff>

<commit_message>
README: make the two routes obvious (project or prompt pack)
- new 'Two ways to use this' section at the top of both READMEs: the project
  route for anyone who can spend five minutes in settings, the prompt pack for
  anyone who cannot or would rather not, with a comparison table and the trade-
  off stated plainly
- commands table marked as belonging to the project route, mapping to Prompts
  1-10 in the pack
- 'Quick start' retitled 'Quick start: as a project' and ends by pointing at the
  pack for anyone who cannot do it
- stale prompt count fixed (nine to eleven) and LINKEDIN.md added to the file
  tables
- both instruction sets now tell the assistant to redirect people who cannot use
  project settings to the prompt pack
- mirrored in full in pt-PT/
</commit_message>
<xml_diff>
--- a/PROJECT-INSTRUCTIONS.docx
+++ b/PROJECT-INSTRUCTIONS.docx
@@ -499,6 +499,33 @@
     </w:p>
     <w:p>
       <w:pPr>
+        <w:spacing w:before="0" w:after="100"/>
+      </w:pPr>
+      <w:r>
+        <w:rPr>
+          <w:rFonts w:ascii="Calibri" w:hAnsi="Calibri"/>
+          <w:sz w:val="21"/>
+        </w:rPr>
+        <w:t xml:space="preserve">If the person cannot use project settings at all, or is working in a plain chat on a phone, point them at </w:t>
+      </w:r>
+      <w:r>
+        <w:rPr>
+          <w:rFonts w:ascii="Consolas" w:hAnsi="Consolas"/>
+          <w:sz w:val="19"/>
+          <w:color w:val="1F2328"/>
+        </w:rPr>
+        <w:t xml:space="preserve">PROMPT-PACK.md</w:t>
+      </w:r>
+      <w:r>
+        <w:rPr>
+          <w:rFonts w:ascii="Calibri" w:hAnsi="Calibri"/>
+          <w:sz w:val="21"/>
+        </w:rPr>
+        <w:t xml:space="preserve">: the same rules delivered as prompts to paste, with no files and no commands.</w:t>
+      </w:r>
+    </w:p>
+    <w:p>
+      <w:pPr>
         <w:spacing w:before="0" w:after="60"/>
       </w:pPr>
     </w:p>

</xml_diff>